<commit_message>
created api for button mini app Promotions in main menu
</commit_message>
<xml_diff>
--- a/Новый документ-3.docx
+++ b/Новый документ-3.docx
@@ -2766,123 +2766,150 @@
         <w:keepLines w:val="false"/>
         <w:spacing w:lineRule="auto" w:line="240" w:before="280" w:after="80"/>
         <w:rPr>
+          <w:highlight w:val="none"/>
+          <w:shd w:fill="81D41A" w:val="clear"/>
+        </w:rPr>
+      </w:pPr>
+      <w:bookmarkStart w:id="13" w:name="_oe8ga6neh10x"/>
+      <w:bookmarkEnd w:id="13"/>
+      <w:r>
+        <w:rPr>
           <w:b/>
           <w:bCs/>
           <w:color w:val="000000"/>
           <w:sz w:val="26"/>
           <w:szCs w:val="26"/>
-        </w:rPr>
-      </w:pPr>
-      <w:bookmarkStart w:id="13" w:name="_oe8ga6neh10x"/>
-      <w:bookmarkEnd w:id="13"/>
+          <w:shd w:fill="81D41A" w:val="clear"/>
+        </w:rPr>
+        <w:t>5.4 Результаты и киллы (для пользователя)</w:t>
+      </w:r>
+    </w:p>
+    <w:p>
+      <w:pPr>
+        <w:pStyle w:val="normal1"/>
+        <w:spacing w:lineRule="auto" w:line="240" w:before="240" w:after="240"/>
+        <w:rPr>
+          <w:highlight w:val="none"/>
+          <w:shd w:fill="81D41A" w:val="clear"/>
+        </w:rPr>
+      </w:pPr>
+      <w:r>
+        <w:rPr>
+          <w:shd w:fill="81D41A" w:val="clear"/>
+        </w:rPr>
+        <w:t>Пользователь видит результаты после публикации:</w:t>
+      </w:r>
+    </w:p>
+    <w:p>
+      <w:pPr>
+        <w:pStyle w:val="normal1"/>
+        <w:numPr>
+          <w:ilvl w:val="0"/>
+          <w:numId w:val="29"/>
+        </w:numPr>
+        <w:spacing w:lineRule="auto" w:line="240" w:before="240" w:after="0"/>
+        <w:ind w:hanging="360" w:start="720"/>
+        <w:rPr>
+          <w:highlight w:val="none"/>
+          <w:shd w:fill="81D41A" w:val="clear"/>
+        </w:rPr>
+      </w:pPr>
+      <w:r>
+        <w:rPr>
+          <w:shd w:fill="81D41A" w:val="clear"/>
+        </w:rPr>
+        <w:t>-“Твои киллы по матчам”</w:t>
+      </w:r>
+    </w:p>
+    <w:p>
+      <w:pPr>
+        <w:pStyle w:val="normal1"/>
+        <w:numPr>
+          <w:ilvl w:val="0"/>
+          <w:numId w:val="29"/>
+        </w:numPr>
+        <w:spacing w:lineRule="auto" w:line="240" w:before="0" w:after="0"/>
+        <w:ind w:hanging="360" w:start="720"/>
+        <w:rPr>
+          <w:highlight w:val="none"/>
+          <w:shd w:fill="81D41A" w:val="clear"/>
+        </w:rPr>
+      </w:pPr>
+      <w:r>
+        <w:rPr>
+          <w:shd w:fill="81D41A" w:val="clear"/>
+        </w:rPr>
+        <w:t>“</w:t>
+      </w:r>
+      <w:r>
+        <w:rPr>
+          <w:shd w:fill="81D41A" w:val="clear"/>
+        </w:rPr>
+        <w:t>Итог турнира”</w:t>
+      </w:r>
+    </w:p>
+    <w:p>
+      <w:pPr>
+        <w:pStyle w:val="normal1"/>
+        <w:numPr>
+          <w:ilvl w:val="0"/>
+          <w:numId w:val="29"/>
+        </w:numPr>
+        <w:spacing w:lineRule="auto" w:line="240" w:before="0" w:after="240"/>
+        <w:ind w:hanging="360" w:start="720"/>
+        <w:rPr>
+          <w:highlight w:val="none"/>
+          <w:shd w:fill="81D41A" w:val="clear"/>
+        </w:rPr>
+      </w:pPr>
+      <w:r>
+        <w:rPr>
+          <w:shd w:fill="81D41A" w:val="clear"/>
+        </w:rPr>
+        <w:t>“</w:t>
+      </w:r>
+      <w:r>
+        <w:rPr>
+          <w:shd w:fill="81D41A" w:val="clear"/>
+        </w:rPr>
+        <w:t>Очки команды”</w:t>
+      </w:r>
+    </w:p>
+    <w:p>
+      <w:pPr>
+        <w:pStyle w:val="normal1"/>
+        <w:spacing w:lineRule="auto" w:line="240" w:before="240" w:after="240"/>
+        <w:rPr>
+          <w:highlight w:val="none"/>
+          <w:shd w:fill="81D41A" w:val="clear"/>
+        </w:rPr>
+      </w:pPr>
       <w:r>
         <w:rPr>
           <w:b/>
           <w:bCs/>
-          <w:color w:val="000000"/>
-          <w:sz w:val="26"/>
-          <w:szCs w:val="26"/>
-        </w:rPr>
-        <w:t>5.4 Результаты и киллы (для пользователя)</w:t>
-      </w:r>
-    </w:p>
-    <w:p>
-      <w:pPr>
-        <w:pStyle w:val="normal1"/>
-        <w:spacing w:lineRule="auto" w:line="240" w:before="240" w:after="240"/>
-        <w:rPr/>
-      </w:pPr>
-      <w:r>
-        <w:rPr/>
-        <w:t>Пользователь видит результаты после публикации:</w:t>
-      </w:r>
-    </w:p>
-    <w:p>
-      <w:pPr>
-        <w:pStyle w:val="normal1"/>
-        <w:numPr>
-          <w:ilvl w:val="0"/>
-          <w:numId w:val="29"/>
-        </w:numPr>
-        <w:spacing w:lineRule="auto" w:line="240" w:before="240" w:after="0"/>
-        <w:ind w:hanging="360" w:start="720"/>
-        <w:rPr/>
-      </w:pPr>
-      <w:r>
-        <w:rPr/>
-        <w:t>“</w:t>
-      </w:r>
-      <w:r>
-        <w:rPr/>
-        <w:t>Твои киллы по матчам”</w:t>
-      </w:r>
-    </w:p>
-    <w:p>
-      <w:pPr>
-        <w:pStyle w:val="normal1"/>
-        <w:numPr>
-          <w:ilvl w:val="0"/>
-          <w:numId w:val="29"/>
-        </w:numPr>
-        <w:spacing w:lineRule="auto" w:line="240" w:before="0" w:after="0"/>
-        <w:ind w:hanging="360" w:start="720"/>
-        <w:rPr/>
-      </w:pPr>
-      <w:r>
-        <w:rPr/>
-        <w:t>“</w:t>
-      </w:r>
-      <w:r>
-        <w:rPr/>
-        <w:t>Итог турнира”</w:t>
-      </w:r>
-    </w:p>
-    <w:p>
-      <w:pPr>
-        <w:pStyle w:val="normal1"/>
-        <w:numPr>
-          <w:ilvl w:val="0"/>
-          <w:numId w:val="29"/>
-        </w:numPr>
-        <w:spacing w:lineRule="auto" w:line="240" w:before="0" w:after="240"/>
-        <w:ind w:hanging="360" w:start="720"/>
-        <w:rPr/>
-      </w:pPr>
-      <w:r>
-        <w:rPr/>
-        <w:t>“</w:t>
-      </w:r>
-      <w:r>
-        <w:rPr/>
-        <w:t>Очки команды”</w:t>
-      </w:r>
-    </w:p>
-    <w:p>
-      <w:pPr>
-        <w:pStyle w:val="normal1"/>
-        <w:spacing w:lineRule="auto" w:line="240" w:before="240" w:after="240"/>
-        <w:rPr/>
-      </w:pPr>
+          <w:shd w:fill="81D41A" w:val="clear"/>
+        </w:rPr>
+        <w:t>Важно:</w:t>
+      </w:r>
+      <w:r>
+        <w:rPr>
+          <w:shd w:fill="81D41A" w:val="clear"/>
+        </w:rPr>
+        <w:t xml:space="preserve"> пользователь </w:t>
+      </w:r>
       <w:r>
         <w:rPr>
           <w:b/>
           <w:bCs/>
-        </w:rPr>
-        <w:t>Важно:</w:t>
-      </w:r>
-      <w:r>
-        <w:rPr/>
-        <w:t xml:space="preserve"> пользователь </w:t>
-      </w:r>
-      <w:r>
-        <w:rPr>
-          <w:b/>
-          <w:bCs/>
+          <w:shd w:fill="81D41A" w:val="clear"/>
         </w:rPr>
         <w:t>не редактирует</w:t>
       </w:r>
       <w:r>
-        <w:rPr/>
+        <w:rPr>
+          <w:shd w:fill="81D41A" w:val="clear"/>
+        </w:rPr>
         <w:t xml:space="preserve"> результаты (чтобы не было путаницы). Он может:</w:t>
       </w:r>
     </w:p>
@@ -2895,10 +2922,15 @@
         </w:numPr>
         <w:spacing w:lineRule="auto" w:line="240" w:before="240" w:after="240"/>
         <w:ind w:hanging="360" w:start="720"/>
-        <w:rPr/>
-      </w:pPr>
-      <w:r>
-        <w:rPr/>
+        <w:rPr>
+          <w:highlight w:val="none"/>
+          <w:shd w:fill="81D41A" w:val="clear"/>
+        </w:rPr>
+      </w:pPr>
+      <w:r>
+        <w:rPr>
+          <w:shd w:fill="81D41A" w:val="clear"/>
+        </w:rPr>
         <w:t>нажать “⚠️ Оспорить результат” → написать причину в поддержку.</w:t>
       </w:r>
     </w:p>
@@ -3418,6 +3450,7 @@
           <w:color w:val="000000"/>
           <w:sz w:val="26"/>
           <w:szCs w:val="26"/>
+          <w:shd w:fill="81D41A" w:val="clear"/>
         </w:rPr>
         <w:t>5</w:t>
       </w:r>
@@ -3430,7 +3463,18 @@
           <w:szCs w:val="26"/>
           <w:shd w:fill="81D41A" w:val="clear"/>
         </w:rPr>
-        <w:t>.6 Кошелёк (CD токен)</w:t>
+        <w:t>.6 Ко</w:t>
+      </w:r>
+      <w:r>
+        <w:rPr>
+          <w:b/>
+          <w:bCs/>
+          <w:color w:val="000000"/>
+          <w:sz w:val="26"/>
+          <w:szCs w:val="26"/>
+          <w:shd w:fill="81D41A" w:val="clear"/>
+        </w:rPr>
+        <w:t>шелёк (CD токен)</w:t>
       </w:r>
     </w:p>
     <w:p>
@@ -3862,276 +3906,349 @@
         <w:keepLines w:val="false"/>
         <w:spacing w:lineRule="auto" w:line="240" w:before="280" w:after="80"/>
         <w:rPr>
+          <w:highlight w:val="none"/>
+          <w:shd w:fill="81D41A" w:val="clear"/>
+        </w:rPr>
+      </w:pPr>
+      <w:bookmarkStart w:id="17" w:name="_s9cy787rw02q"/>
+      <w:bookmarkEnd w:id="17"/>
+      <w:r>
+        <w:rPr>
           <w:b/>
           <w:bCs/>
           <w:color w:val="000000"/>
           <w:sz w:val="26"/>
           <w:szCs w:val="26"/>
-        </w:rPr>
-      </w:pPr>
-      <w:bookmarkStart w:id="17" w:name="_s9cy787rw02q"/>
-      <w:bookmarkEnd w:id="17"/>
+          <w:shd w:fill="81D41A" w:val="clear"/>
+        </w:rPr>
+        <w:t>5.8 Акции и розыгрыши</w:t>
+      </w:r>
+    </w:p>
+    <w:p>
+      <w:pPr>
+        <w:pStyle w:val="normal1"/>
+        <w:spacing w:lineRule="auto" w:line="240" w:before="240" w:after="240"/>
+        <w:rPr>
+          <w:highlight w:val="none"/>
+          <w:shd w:fill="81D41A" w:val="clear"/>
+        </w:rPr>
+      </w:pPr>
       <w:r>
         <w:rPr>
           <w:b/>
           <w:bCs/>
-          <w:color w:val="000000"/>
-          <w:sz w:val="26"/>
-          <w:szCs w:val="26"/>
-        </w:rPr>
-        <w:t>5.8 Акции и розыгрыши</w:t>
+          <w:shd w:fill="81D41A" w:val="clear"/>
+        </w:rPr>
+        <w:t>Экран “Акции и розыгрыши”:</w:t>
+      </w:r>
+    </w:p>
+    <w:p>
+      <w:pPr>
+        <w:pStyle w:val="normal1"/>
+        <w:numPr>
+          <w:ilvl w:val="0"/>
+          <w:numId w:val="42"/>
+        </w:numPr>
+        <w:spacing w:lineRule="auto" w:line="240" w:before="240" w:after="0"/>
+        <w:ind w:hanging="360" w:start="720"/>
+        <w:rPr>
+          <w:highlight w:val="none"/>
+          <w:shd w:fill="81D41A" w:val="clear"/>
+        </w:rPr>
+      </w:pPr>
+      <w:r>
+        <w:rPr>
+          <w:shd w:fill="81D41A" w:val="clear"/>
+        </w:rPr>
+        <w:t>Список активных событий (карточки):</w:t>
+      </w:r>
+    </w:p>
+    <w:p>
+      <w:pPr>
+        <w:pStyle w:val="normal1"/>
+        <w:numPr>
+          <w:ilvl w:val="1"/>
+          <w:numId w:val="42"/>
+        </w:numPr>
+        <w:spacing w:lineRule="auto" w:line="240" w:before="0" w:after="0"/>
+        <w:ind w:hanging="360" w:start="1440"/>
+        <w:rPr>
+          <w:highlight w:val="none"/>
+          <w:shd w:fill="81D41A" w:val="clear"/>
+        </w:rPr>
+      </w:pPr>
+      <w:r>
+        <w:rPr>
+          <w:shd w:fill="81D41A" w:val="clear"/>
+        </w:rPr>
+        <w:t>Название</w:t>
+      </w:r>
+    </w:p>
+    <w:p>
+      <w:pPr>
+        <w:pStyle w:val="normal1"/>
+        <w:numPr>
+          <w:ilvl w:val="1"/>
+          <w:numId w:val="42"/>
+        </w:numPr>
+        <w:spacing w:lineRule="auto" w:line="240" w:before="0" w:after="0"/>
+        <w:ind w:hanging="360" w:start="1440"/>
+        <w:rPr>
+          <w:highlight w:val="none"/>
+          <w:shd w:fill="81D41A" w:val="clear"/>
+        </w:rPr>
+      </w:pPr>
+      <w:r>
+        <w:rPr>
+          <w:shd w:fill="81D41A" w:val="clear"/>
+        </w:rPr>
+        <w:t>До какого числа</w:t>
+      </w:r>
+    </w:p>
+    <w:p>
+      <w:pPr>
+        <w:pStyle w:val="normal1"/>
+        <w:numPr>
+          <w:ilvl w:val="1"/>
+          <w:numId w:val="42"/>
+        </w:numPr>
+        <w:spacing w:lineRule="auto" w:line="240" w:before="0" w:after="0"/>
+        <w:ind w:hanging="360" w:start="1440"/>
+        <w:rPr>
+          <w:highlight w:val="none"/>
+          <w:shd w:fill="81D41A" w:val="clear"/>
+        </w:rPr>
+      </w:pPr>
+      <w:r>
+        <w:rPr>
+          <w:shd w:fill="81D41A" w:val="clear"/>
+        </w:rPr>
+        <w:t>Как участвовать (условия)</w:t>
+      </w:r>
+    </w:p>
+    <w:p>
+      <w:pPr>
+        <w:pStyle w:val="normal1"/>
+        <w:numPr>
+          <w:ilvl w:val="1"/>
+          <w:numId w:val="42"/>
+        </w:numPr>
+        <w:spacing w:lineRule="auto" w:line="240" w:before="0" w:after="240"/>
+        <w:ind w:hanging="360" w:start="1440"/>
+        <w:rPr>
+          <w:highlight w:val="none"/>
+          <w:shd w:fill="81D41A" w:val="clear"/>
+        </w:rPr>
+      </w:pPr>
+      <w:r>
+        <w:rPr>
+          <w:shd w:fill="81D41A" w:val="clear"/>
+        </w:rPr>
+        <w:t>Призы</w:t>
       </w:r>
     </w:p>
     <w:p>
       <w:pPr>
         <w:pStyle w:val="normal1"/>
         <w:spacing w:lineRule="auto" w:line="240" w:before="240" w:after="240"/>
+        <w:rPr>
+          <w:highlight w:val="none"/>
+          <w:shd w:fill="81D41A" w:val="clear"/>
+        </w:rPr>
+      </w:pPr>
+      <w:r>
         <w:rPr>
           <w:b/>
           <w:bCs/>
-        </w:rPr>
-      </w:pPr>
-      <w:r>
-        <w:rPr>
-          <w:b/>
-          <w:bCs/>
-        </w:rPr>
-        <w:t>Экран “Акции и розыгрыши”:</w:t>
-      </w:r>
-    </w:p>
-    <w:p>
-      <w:pPr>
-        <w:pStyle w:val="normal1"/>
-        <w:numPr>
-          <w:ilvl w:val="0"/>
-          <w:numId w:val="42"/>
+          <w:shd w:fill="81D41A" w:val="clear"/>
+        </w:rPr>
+        <w:t>Карточка розыгрыша:</w:t>
+      </w:r>
+    </w:p>
+    <w:p>
+      <w:pPr>
+        <w:pStyle w:val="normal1"/>
+        <w:numPr>
+          <w:ilvl w:val="0"/>
+          <w:numId w:val="12"/>
         </w:numPr>
         <w:spacing w:lineRule="auto" w:line="240" w:before="240" w:after="0"/>
         <w:ind w:hanging="360" w:start="720"/>
-        <w:rPr/>
-      </w:pPr>
-      <w:r>
-        <w:rPr/>
-        <w:t>Список активных событий (карточки):</w:t>
-      </w:r>
-    </w:p>
-    <w:p>
-      <w:pPr>
-        <w:pStyle w:val="normal1"/>
-        <w:numPr>
-          <w:ilvl w:val="1"/>
-          <w:numId w:val="42"/>
+        <w:rPr>
+          <w:highlight w:val="none"/>
+          <w:shd w:fill="81D41A" w:val="clear"/>
+        </w:rPr>
+      </w:pPr>
+      <w:r>
+        <w:rPr>
+          <w:shd w:fill="81D41A" w:val="clear"/>
+        </w:rPr>
+        <w:t>Условия участия (например: “1 билет = 50 CD токен”)</w:t>
+      </w:r>
+    </w:p>
+    <w:p>
+      <w:pPr>
+        <w:pStyle w:val="normal1"/>
+        <w:numPr>
+          <w:ilvl w:val="0"/>
+          <w:numId w:val="12"/>
         </w:numPr>
         <w:spacing w:lineRule="auto" w:line="240" w:before="0" w:after="0"/>
-        <w:ind w:hanging="360" w:start="1440"/>
-        <w:rPr/>
-      </w:pPr>
-      <w:r>
-        <w:rPr/>
-        <w:t>Название</w:t>
-      </w:r>
-    </w:p>
-    <w:p>
-      <w:pPr>
-        <w:pStyle w:val="normal1"/>
-        <w:numPr>
-          <w:ilvl w:val="1"/>
-          <w:numId w:val="42"/>
+        <w:ind w:hanging="360" w:start="720"/>
+        <w:rPr>
+          <w:highlight w:val="none"/>
+          <w:shd w:fill="81D41A" w:val="clear"/>
+        </w:rPr>
+      </w:pPr>
+      <w:r>
+        <w:rPr>
+          <w:shd w:fill="81D41A" w:val="clear"/>
+        </w:rPr>
+        <w:t>Сколько у тебя билетов</w:t>
+      </w:r>
+    </w:p>
+    <w:p>
+      <w:pPr>
+        <w:pStyle w:val="normal1"/>
+        <w:numPr>
+          <w:ilvl w:val="0"/>
+          <w:numId w:val="12"/>
+        </w:numPr>
+        <w:spacing w:lineRule="auto" w:line="240" w:before="0" w:after="240"/>
+        <w:ind w:hanging="360" w:start="720"/>
+        <w:rPr>
+          <w:highlight w:val="none"/>
+          <w:shd w:fill="81D41A" w:val="clear"/>
+        </w:rPr>
+      </w:pPr>
+      <w:r>
+        <w:rPr>
+          <w:shd w:fill="81D41A" w:val="clear"/>
+        </w:rPr>
+        <w:t>Когда объявление победителей</w:t>
+      </w:r>
+    </w:p>
+    <w:p>
+      <w:pPr>
+        <w:pStyle w:val="normal1"/>
+        <w:spacing w:lineRule="auto" w:line="240" w:before="240" w:after="240"/>
+        <w:rPr>
+          <w:highlight w:val="none"/>
+          <w:shd w:fill="81D41A" w:val="clear"/>
+        </w:rPr>
+      </w:pPr>
+      <w:r>
+        <w:rPr>
+          <w:shd w:fill="81D41A" w:val="clear"/>
+        </w:rPr>
+        <w:t>Кнопки:</w:t>
+      </w:r>
+    </w:p>
+    <w:p>
+      <w:pPr>
+        <w:pStyle w:val="normal1"/>
+        <w:numPr>
+          <w:ilvl w:val="0"/>
+          <w:numId w:val="17"/>
+        </w:numPr>
+        <w:spacing w:lineRule="auto" w:line="240" w:before="240" w:after="0"/>
+        <w:ind w:hanging="360" w:start="720"/>
+        <w:rPr>
+          <w:highlight w:val="none"/>
+          <w:shd w:fill="81D41A" w:val="clear"/>
+        </w:rPr>
+      </w:pPr>
+      <w:r>
+        <w:rPr>
+          <w:shd w:fill="81D41A" w:val="clear"/>
+        </w:rPr>
+        <w:t xml:space="preserve">🎫 </w:t>
+      </w:r>
+      <w:r>
+        <w:rPr>
+          <w:shd w:fill="81D41A" w:val="clear"/>
+        </w:rPr>
+        <w:t>Получить билет (спишет CD токен → подтверждение)</w:t>
+      </w:r>
+    </w:p>
+    <w:p>
+      <w:pPr>
+        <w:pStyle w:val="normal1"/>
+        <w:numPr>
+          <w:ilvl w:val="0"/>
+          <w:numId w:val="17"/>
         </w:numPr>
         <w:spacing w:lineRule="auto" w:line="240" w:before="0" w:after="0"/>
-        <w:ind w:hanging="360" w:start="1440"/>
-        <w:rPr/>
-      </w:pPr>
-      <w:r>
-        <w:rPr/>
-        <w:t>До какого числа</w:t>
-      </w:r>
-    </w:p>
-    <w:p>
-      <w:pPr>
-        <w:pStyle w:val="normal1"/>
-        <w:numPr>
-          <w:ilvl w:val="1"/>
-          <w:numId w:val="42"/>
+        <w:ind w:hanging="360" w:start="720"/>
+        <w:rPr>
+          <w:highlight w:val="none"/>
+          <w:shd w:fill="81D41A" w:val="clear"/>
+        </w:rPr>
+      </w:pPr>
+      <w:r>
+        <w:rPr>
+          <w:shd w:fill="81D41A" w:val="clear"/>
+        </w:rPr>
+        <w:t xml:space="preserve">📋 </w:t>
+      </w:r>
+      <w:r>
+        <w:rPr>
+          <w:shd w:fill="81D41A" w:val="clear"/>
+        </w:rPr>
+        <w:t>Условия</w:t>
+      </w:r>
+    </w:p>
+    <w:p>
+      <w:pPr>
+        <w:pStyle w:val="normal1"/>
+        <w:numPr>
+          <w:ilvl w:val="0"/>
+          <w:numId w:val="17"/>
         </w:numPr>
         <w:spacing w:lineRule="auto" w:line="240" w:before="0" w:after="0"/>
-        <w:ind w:hanging="360" w:start="1440"/>
-        <w:rPr/>
-      </w:pPr>
-      <w:r>
-        <w:rPr/>
-        <w:t>Как участвовать (условия)</w:t>
-      </w:r>
-    </w:p>
-    <w:p>
-      <w:pPr>
-        <w:pStyle w:val="normal1"/>
-        <w:numPr>
-          <w:ilvl w:val="1"/>
-          <w:numId w:val="42"/>
+        <w:ind w:hanging="360" w:start="720"/>
+        <w:rPr>
+          <w:highlight w:val="none"/>
+          <w:shd w:fill="81D41A" w:val="clear"/>
+        </w:rPr>
+      </w:pPr>
+      <w:r>
+        <w:rPr>
+          <w:shd w:fill="81D41A" w:val="clear"/>
+        </w:rPr>
+        <w:t xml:space="preserve">🏁 </w:t>
+      </w:r>
+      <w:r>
+        <w:rPr>
+          <w:shd w:fill="81D41A" w:val="clear"/>
+        </w:rPr>
+        <w:t>Результаты (после окончания)</w:t>
+      </w:r>
+    </w:p>
+    <w:p>
+      <w:pPr>
+        <w:pStyle w:val="normal1"/>
+        <w:numPr>
+          <w:ilvl w:val="0"/>
+          <w:numId w:val="17"/>
         </w:numPr>
         <w:spacing w:lineRule="auto" w:line="240" w:before="0" w:after="240"/>
-        <w:ind w:hanging="360" w:start="1440"/>
-        <w:rPr/>
-      </w:pPr>
-      <w:r>
-        <w:rPr/>
-        <w:t>Призы</w:t>
-      </w:r>
-    </w:p>
-    <w:p>
-      <w:pPr>
-        <w:pStyle w:val="normal1"/>
-        <w:spacing w:lineRule="auto" w:line="240" w:before="240" w:after="240"/>
-        <w:rPr>
-          <w:b/>
-          <w:bCs/>
-        </w:rPr>
-      </w:pPr>
-      <w:r>
-        <w:rPr>
-          <w:b/>
-          <w:bCs/>
-        </w:rPr>
-        <w:t>Карточка розыгрыша:</w:t>
-      </w:r>
-    </w:p>
-    <w:p>
-      <w:pPr>
-        <w:pStyle w:val="normal1"/>
-        <w:numPr>
-          <w:ilvl w:val="0"/>
-          <w:numId w:val="12"/>
-        </w:numPr>
-        <w:spacing w:lineRule="auto" w:line="240" w:before="240" w:after="0"/>
-        <w:ind w:hanging="360" w:start="720"/>
-        <w:rPr/>
-      </w:pPr>
-      <w:r>
-        <w:rPr/>
-        <w:t>Условия участия (например: “1 билет = 50 CD токен”)</w:t>
-      </w:r>
-    </w:p>
-    <w:p>
-      <w:pPr>
-        <w:pStyle w:val="normal1"/>
-        <w:numPr>
-          <w:ilvl w:val="0"/>
-          <w:numId w:val="12"/>
-        </w:numPr>
-        <w:spacing w:lineRule="auto" w:line="240" w:before="0" w:after="0"/>
-        <w:ind w:hanging="360" w:start="720"/>
-        <w:rPr/>
-      </w:pPr>
-      <w:r>
-        <w:rPr/>
-        <w:t>Сколько у тебя билетов</w:t>
-      </w:r>
-    </w:p>
-    <w:p>
-      <w:pPr>
-        <w:pStyle w:val="normal1"/>
-        <w:numPr>
-          <w:ilvl w:val="0"/>
-          <w:numId w:val="12"/>
-        </w:numPr>
-        <w:spacing w:lineRule="auto" w:line="240" w:before="0" w:after="240"/>
-        <w:ind w:hanging="360" w:start="720"/>
-        <w:rPr/>
-      </w:pPr>
-      <w:r>
-        <w:rPr/>
-        <w:t>Когда объявление победителей</w:t>
-      </w:r>
-    </w:p>
-    <w:p>
-      <w:pPr>
-        <w:pStyle w:val="normal1"/>
-        <w:spacing w:lineRule="auto" w:line="240" w:before="240" w:after="240"/>
-        <w:rPr/>
-      </w:pPr>
-      <w:r>
-        <w:rPr/>
-        <w:t>Кнопки:</w:t>
-      </w:r>
-    </w:p>
-    <w:p>
-      <w:pPr>
-        <w:pStyle w:val="normal1"/>
-        <w:numPr>
-          <w:ilvl w:val="0"/>
-          <w:numId w:val="17"/>
-        </w:numPr>
-        <w:spacing w:lineRule="auto" w:line="240" w:before="240" w:after="0"/>
-        <w:ind w:hanging="360" w:start="720"/>
-        <w:rPr/>
-      </w:pPr>
-      <w:r>
-        <w:rPr/>
-        <w:t xml:space="preserve">🎫 </w:t>
-      </w:r>
-      <w:r>
-        <w:rPr/>
-        <w:t>Получить билет (спишет CD токен → подтверждение)</w:t>
-      </w:r>
-    </w:p>
-    <w:p>
-      <w:pPr>
-        <w:pStyle w:val="normal1"/>
-        <w:numPr>
-          <w:ilvl w:val="0"/>
-          <w:numId w:val="17"/>
-        </w:numPr>
-        <w:spacing w:lineRule="auto" w:line="240" w:before="0" w:after="0"/>
-        <w:ind w:hanging="360" w:start="720"/>
-        <w:rPr/>
-      </w:pPr>
-      <w:r>
-        <w:rPr/>
-        <w:t xml:space="preserve">📋 </w:t>
-      </w:r>
-      <w:r>
-        <w:rPr/>
-        <w:t>Условия</w:t>
-      </w:r>
-    </w:p>
-    <w:p>
-      <w:pPr>
-        <w:pStyle w:val="normal1"/>
-        <w:numPr>
-          <w:ilvl w:val="0"/>
-          <w:numId w:val="17"/>
-        </w:numPr>
-        <w:spacing w:lineRule="auto" w:line="240" w:before="0" w:after="0"/>
-        <w:ind w:hanging="360" w:start="720"/>
-        <w:rPr/>
-      </w:pPr>
-      <w:r>
-        <w:rPr/>
-        <w:t xml:space="preserve">🏁 </w:t>
-      </w:r>
-      <w:r>
-        <w:rPr/>
-        <w:t>Результаты (после окончания)</w:t>
-      </w:r>
-    </w:p>
-    <w:p>
-      <w:pPr>
-        <w:pStyle w:val="normal1"/>
-        <w:numPr>
-          <w:ilvl w:val="0"/>
-          <w:numId w:val="17"/>
-        </w:numPr>
-        <w:spacing w:lineRule="auto" w:line="240" w:before="0" w:after="240"/>
-        <w:ind w:hanging="360" w:start="720"/>
-        <w:rPr/>
-      </w:pPr>
-      <w:r>
-        <w:rPr/>
+        <w:ind w:hanging="360" w:start="720"/>
+        <w:rPr>
+          <w:highlight w:val="none"/>
+          <w:shd w:fill="81D41A" w:val="clear"/>
+        </w:rPr>
+      </w:pPr>
+      <w:r>
+        <w:rPr>
+          <w:shd w:fill="81D41A" w:val="clear"/>
+        </w:rPr>
         <w:t xml:space="preserve">⬅️ </w:t>
       </w:r>
       <w:r>
-        <w:rPr/>
+        <w:rPr>
+          <w:shd w:fill="81D41A" w:val="clear"/>
+        </w:rPr>
         <w:t>Назад</w:t>
       </w:r>
     </w:p>
@@ -4203,24 +4320,124 @@
         <w:keepLines w:val="false"/>
         <w:spacing w:lineRule="auto" w:line="240" w:before="280" w:after="80"/>
         <w:rPr>
+          <w:highlight w:val="none"/>
+          <w:shd w:fill="81D41A" w:val="clear"/>
+        </w:rPr>
+      </w:pPr>
+      <w:bookmarkStart w:id="18" w:name="_qjxazpbvhua"/>
+      <w:bookmarkEnd w:id="18"/>
+      <w:r>
+        <w:rPr>
           <w:b/>
           <w:bCs/>
           <w:color w:val="000000"/>
           <w:sz w:val="26"/>
           <w:szCs w:val="26"/>
-        </w:rPr>
-      </w:pPr>
-      <w:bookmarkStart w:id="18" w:name="_qjxazpbvhua"/>
-      <w:bookmarkEnd w:id="18"/>
+          <w:shd w:fill="81D41A" w:val="clear"/>
+        </w:rPr>
+        <w:t>5.9 Пригласи друга / рефералка</w:t>
+      </w:r>
+    </w:p>
+    <w:p>
+      <w:pPr>
+        <w:pStyle w:val="normal1"/>
+        <w:spacing w:lineRule="auto" w:line="240" w:before="240" w:after="240"/>
+        <w:rPr>
+          <w:highlight w:val="none"/>
+          <w:shd w:fill="81D41A" w:val="clear"/>
+        </w:rPr>
+      </w:pPr>
       <w:r>
         <w:rPr>
           <w:b/>
           <w:bCs/>
-          <w:color w:val="000000"/>
-          <w:sz w:val="26"/>
-          <w:szCs w:val="26"/>
-        </w:rPr>
-        <w:t>5.9 Пригласи друга / рефералка</w:t>
+          <w:shd w:fill="81D41A" w:val="clear"/>
+        </w:rPr>
+        <w:t>Экран “Пригласи друга”:</w:t>
+      </w:r>
+    </w:p>
+    <w:p>
+      <w:pPr>
+        <w:pStyle w:val="normal1"/>
+        <w:numPr>
+          <w:ilvl w:val="0"/>
+          <w:numId w:val="16"/>
+        </w:numPr>
+        <w:spacing w:lineRule="auto" w:line="240" w:before="240" w:after="0"/>
+        <w:ind w:hanging="360" w:start="720"/>
+        <w:rPr>
+          <w:highlight w:val="none"/>
+          <w:shd w:fill="81D41A" w:val="clear"/>
+        </w:rPr>
+      </w:pPr>
+      <w:r>
+        <w:rPr>
+          <w:shd w:fill="81D41A" w:val="clear"/>
+        </w:rPr>
+        <w:t>Твоя персональная ссылка</w:t>
+      </w:r>
+    </w:p>
+    <w:p>
+      <w:pPr>
+        <w:pStyle w:val="normal1"/>
+        <w:numPr>
+          <w:ilvl w:val="0"/>
+          <w:numId w:val="16"/>
+        </w:numPr>
+        <w:spacing w:lineRule="auto" w:line="240" w:before="0" w:after="0"/>
+        <w:ind w:hanging="360" w:start="720"/>
+        <w:rPr>
+          <w:highlight w:val="none"/>
+          <w:shd w:fill="81D41A" w:val="clear"/>
+        </w:rPr>
+      </w:pPr>
+      <w:r>
+        <w:rPr>
+          <w:shd w:fill="81D41A" w:val="clear"/>
+        </w:rPr>
+        <w:t>Сколько приглашено</w:t>
+      </w:r>
+    </w:p>
+    <w:p>
+      <w:pPr>
+        <w:pStyle w:val="normal1"/>
+        <w:numPr>
+          <w:ilvl w:val="0"/>
+          <w:numId w:val="16"/>
+        </w:numPr>
+        <w:spacing w:lineRule="auto" w:line="240" w:before="0" w:after="0"/>
+        <w:ind w:hanging="360" w:start="720"/>
+        <w:rPr>
+          <w:highlight w:val="none"/>
+          <w:shd w:fill="81D41A" w:val="clear"/>
+        </w:rPr>
+      </w:pPr>
+      <w:r>
+        <w:rPr>
+          <w:shd w:fill="81D41A" w:val="clear"/>
+        </w:rPr>
+        <w:t>Сколько начислено бонусов</w:t>
+      </w:r>
+    </w:p>
+    <w:p>
+      <w:pPr>
+        <w:pStyle w:val="normal1"/>
+        <w:numPr>
+          <w:ilvl w:val="0"/>
+          <w:numId w:val="16"/>
+        </w:numPr>
+        <w:spacing w:lineRule="auto" w:line="240" w:before="0" w:after="240"/>
+        <w:ind w:hanging="360" w:start="720"/>
+        <w:rPr>
+          <w:highlight w:val="none"/>
+          <w:shd w:fill="81D41A" w:val="clear"/>
+        </w:rPr>
+      </w:pPr>
+      <w:r>
+        <w:rPr>
+          <w:shd w:fill="81D41A" w:val="clear"/>
+        </w:rPr>
+        <w:t>Правила (коротко)</w:t>
       </w:r>
     </w:p>
     <w:p>
@@ -4228,150 +4445,95 @@
         <w:pStyle w:val="normal1"/>
         <w:spacing w:lineRule="auto" w:line="240" w:before="240" w:after="240"/>
         <w:rPr>
-          <w:b/>
-          <w:bCs/>
-        </w:rPr>
-      </w:pPr>
-      <w:r>
-        <w:rPr>
-          <w:b/>
-          <w:bCs/>
-        </w:rPr>
-        <w:t>Экран “Пригласи друга”:</w:t>
-      </w:r>
-    </w:p>
-    <w:p>
-      <w:pPr>
-        <w:pStyle w:val="normal1"/>
-        <w:numPr>
-          <w:ilvl w:val="0"/>
-          <w:numId w:val="16"/>
+          <w:highlight w:val="none"/>
+          <w:shd w:fill="81D41A" w:val="clear"/>
+        </w:rPr>
+      </w:pPr>
+      <w:r>
+        <w:rPr>
+          <w:shd w:fill="81D41A" w:val="clear"/>
+        </w:rPr>
+        <w:t>Кнопки:</w:t>
+      </w:r>
+    </w:p>
+    <w:p>
+      <w:pPr>
+        <w:pStyle w:val="normal1"/>
+        <w:numPr>
+          <w:ilvl w:val="0"/>
+          <w:numId w:val="43"/>
         </w:numPr>
         <w:spacing w:lineRule="auto" w:line="240" w:before="240" w:after="0"/>
         <w:ind w:hanging="360" w:start="720"/>
-        <w:rPr/>
-      </w:pPr>
-      <w:r>
-        <w:rPr/>
-        <w:t>Твоя персональная ссылка</w:t>
-      </w:r>
-    </w:p>
-    <w:p>
-      <w:pPr>
-        <w:pStyle w:val="normal1"/>
-        <w:numPr>
-          <w:ilvl w:val="0"/>
-          <w:numId w:val="16"/>
+        <w:rPr>
+          <w:highlight w:val="none"/>
+          <w:shd w:fill="81D41A" w:val="clear"/>
+        </w:rPr>
+      </w:pPr>
+      <w:r>
+        <w:rPr>
+          <w:shd w:fill="81D41A" w:val="clear"/>
+        </w:rPr>
+        <w:t xml:space="preserve">📤 </w:t>
+      </w:r>
+      <w:r>
+        <w:rPr>
+          <w:shd w:fill="81D41A" w:val="clear"/>
+        </w:rPr>
+        <w:t>Поделиться ссылкой</w:t>
+      </w:r>
+    </w:p>
+    <w:p>
+      <w:pPr>
+        <w:pStyle w:val="normal1"/>
+        <w:numPr>
+          <w:ilvl w:val="0"/>
+          <w:numId w:val="43"/>
         </w:numPr>
         <w:spacing w:lineRule="auto" w:line="240" w:before="0" w:after="0"/>
         <w:ind w:hanging="360" w:start="720"/>
-        <w:rPr/>
-      </w:pPr>
-      <w:r>
-        <w:rPr/>
-        <w:t>Сколько приглашено</w:t>
-      </w:r>
-    </w:p>
-    <w:p>
-      <w:pPr>
-        <w:pStyle w:val="normal1"/>
-        <w:numPr>
-          <w:ilvl w:val="0"/>
-          <w:numId w:val="16"/>
-        </w:numPr>
-        <w:spacing w:lineRule="auto" w:line="240" w:before="0" w:after="0"/>
-        <w:ind w:hanging="360" w:start="720"/>
-        <w:rPr/>
-      </w:pPr>
-      <w:r>
-        <w:rPr/>
-        <w:t>Сколько начислено бонусов</w:t>
-      </w:r>
-    </w:p>
-    <w:p>
-      <w:pPr>
-        <w:pStyle w:val="normal1"/>
-        <w:numPr>
-          <w:ilvl w:val="0"/>
-          <w:numId w:val="16"/>
+        <w:rPr>
+          <w:highlight w:val="none"/>
+          <w:shd w:fill="81D41A" w:val="clear"/>
+        </w:rPr>
+      </w:pPr>
+      <w:r>
+        <w:rPr>
+          <w:shd w:fill="81D41A" w:val="clear"/>
+        </w:rPr>
+        <w:t xml:space="preserve">📜 </w:t>
+      </w:r>
+      <w:r>
+        <w:rPr>
+          <w:shd w:fill="81D41A" w:val="clear"/>
+        </w:rPr>
+        <w:t>Правила</w:t>
+      </w:r>
+    </w:p>
+    <w:p>
+      <w:pPr>
+        <w:pStyle w:val="normal1"/>
+        <w:numPr>
+          <w:ilvl w:val="0"/>
+          <w:numId w:val="43"/>
         </w:numPr>
         <w:spacing w:lineRule="auto" w:line="240" w:before="0" w:after="240"/>
         <w:ind w:hanging="360" w:start="720"/>
-        <w:rPr/>
-      </w:pPr>
-      <w:r>
-        <w:rPr/>
-        <w:t>Правила (коротко)</w:t>
-      </w:r>
-    </w:p>
-    <w:p>
-      <w:pPr>
-        <w:pStyle w:val="normal1"/>
-        <w:spacing w:lineRule="auto" w:line="240" w:before="240" w:after="240"/>
-        <w:rPr/>
-      </w:pPr>
-      <w:r>
-        <w:rPr/>
-        <w:t>Кнопки:</w:t>
-      </w:r>
-    </w:p>
-    <w:p>
-      <w:pPr>
-        <w:pStyle w:val="normal1"/>
-        <w:numPr>
-          <w:ilvl w:val="0"/>
-          <w:numId w:val="43"/>
-        </w:numPr>
-        <w:spacing w:lineRule="auto" w:line="240" w:before="240" w:after="0"/>
-        <w:ind w:hanging="360" w:start="720"/>
-        <w:rPr/>
-      </w:pPr>
-      <w:r>
-        <w:rPr/>
-        <w:t xml:space="preserve">📤 </w:t>
-      </w:r>
-      <w:r>
-        <w:rPr/>
-        <w:t>Поделиться ссылкой</w:t>
-      </w:r>
-    </w:p>
-    <w:p>
-      <w:pPr>
-        <w:pStyle w:val="normal1"/>
-        <w:numPr>
-          <w:ilvl w:val="0"/>
-          <w:numId w:val="43"/>
-        </w:numPr>
-        <w:spacing w:lineRule="auto" w:line="240" w:before="0" w:after="0"/>
-        <w:ind w:hanging="360" w:start="720"/>
-        <w:rPr/>
-      </w:pPr>
-      <w:r>
-        <w:rPr/>
-        <w:t xml:space="preserve">📜 </w:t>
-      </w:r>
-      <w:r>
-        <w:rPr/>
-        <w:t>Правила</w:t>
-      </w:r>
-    </w:p>
-    <w:p>
-      <w:pPr>
-        <w:pStyle w:val="normal1"/>
-        <w:numPr>
-          <w:ilvl w:val="0"/>
-          <w:numId w:val="43"/>
-        </w:numPr>
-        <w:spacing w:lineRule="auto" w:line="240" w:before="0" w:after="240"/>
-        <w:ind w:hanging="360" w:start="720"/>
-        <w:rPr/>
-      </w:pPr>
-      <w:r>
-        <w:rPr/>
+        <w:rPr>
+          <w:highlight w:val="none"/>
+          <w:shd w:fill="81D41A" w:val="clear"/>
+        </w:rPr>
+      </w:pPr>
+      <w:r>
+        <w:rPr>
+          <w:shd w:fill="81D41A" w:val="clear"/>
+        </w:rPr>
         <w:t xml:space="preserve">⬅️ </w:t>
       </w:r>
       <w:r>
-        <w:rPr/>
+        <w:rPr>
+          <w:shd w:fill="81D41A" w:val="clear"/>
+        </w:rPr>
         <w:t>Назад</w:t>
       </w:r>
     </w:p>
@@ -4585,20 +4747,19 @@
         <w:keepLines w:val="false"/>
         <w:spacing w:lineRule="auto" w:line="240" w:before="480" w:after="120"/>
         <w:rPr>
+          <w:highlight w:val="none"/>
+          <w:shd w:fill="81D41A" w:val="clear"/>
+        </w:rPr>
+      </w:pPr>
+      <w:bookmarkStart w:id="20" w:name="_65h87cq2lyjp"/>
+      <w:bookmarkEnd w:id="20"/>
+      <w:r>
+        <w:rPr>
           <w:b/>
           <w:bCs/>
           <w:sz w:val="46"/>
           <w:szCs w:val="46"/>
-        </w:rPr>
-      </w:pPr>
-      <w:bookmarkStart w:id="20" w:name="_65h87cq2lyjp"/>
-      <w:bookmarkEnd w:id="20"/>
-      <w:r>
-        <w:rPr>
-          <w:b/>
-          <w:bCs/>
-          <w:sz w:val="46"/>
-          <w:szCs w:val="46"/>
+          <w:shd w:fill="81D41A" w:val="clear"/>
         </w:rPr>
         <w:t>6) Правила подсчёта результатов (киллы и очки команды)</w:t>
       </w:r>
@@ -4610,148 +4771,174 @@
         <w:keepLines w:val="false"/>
         <w:spacing w:lineRule="auto" w:line="240" w:before="360" w:after="80"/>
         <w:rPr>
+          <w:highlight w:val="none"/>
+          <w:shd w:fill="81D41A" w:val="clear"/>
+        </w:rPr>
+      </w:pPr>
+      <w:bookmarkStart w:id="21" w:name="_s2gc9je7t31t"/>
+      <w:bookmarkEnd w:id="21"/>
+      <w:r>
+        <w:rPr>
           <w:b/>
           <w:bCs/>
           <w:sz w:val="34"/>
           <w:szCs w:val="34"/>
-        </w:rPr>
-      </w:pPr>
-      <w:bookmarkStart w:id="21" w:name="_s2gc9je7t31t"/>
-      <w:bookmarkEnd w:id="21"/>
+          <w:shd w:fill="81D41A" w:val="clear"/>
+        </w:rPr>
+        <w:t>6.1 Индивидуальные очки (игрок)</w:t>
+      </w:r>
+    </w:p>
+    <w:p>
+      <w:pPr>
+        <w:pStyle w:val="normal1"/>
+        <w:spacing w:lineRule="auto" w:line="240" w:before="240" w:after="240"/>
+        <w:rPr>
+          <w:highlight w:val="none"/>
+          <w:shd w:fill="81D41A" w:val="clear"/>
+        </w:rPr>
+      </w:pPr>
+      <w:r>
+        <w:rPr>
+          <w:shd w:fill="81D41A" w:val="clear"/>
+        </w:rPr>
+        <w:t>Так как “чисто киллы берём в расчёт”:</w:t>
+      </w:r>
+    </w:p>
+    <w:p>
+      <w:pPr>
+        <w:pStyle w:val="normal1"/>
+        <w:numPr>
+          <w:ilvl w:val="0"/>
+          <w:numId w:val="7"/>
+        </w:numPr>
+        <w:spacing w:lineRule="auto" w:line="240" w:before="240" w:after="240"/>
+        <w:ind w:hanging="360" w:start="720"/>
+        <w:rPr>
+          <w:highlight w:val="none"/>
+          <w:shd w:fill="81D41A" w:val="clear"/>
+        </w:rPr>
+      </w:pPr>
+      <w:r>
+        <w:rPr>
+          <w:b/>
+          <w:bCs/>
+          <w:shd w:fill="81D41A" w:val="clear"/>
+        </w:rPr>
+        <w:t>Очки игрока = количество киллов</w:t>
+      </w:r>
+    </w:p>
+    <w:p>
+      <w:pPr>
+        <w:pStyle w:val="normal1"/>
+        <w:spacing w:lineRule="auto" w:line="240" w:before="240" w:after="240"/>
+        <w:rPr>
+          <w:highlight w:val="none"/>
+          <w:shd w:fill="81D41A" w:val="clear"/>
+        </w:rPr>
+      </w:pPr>
+      <w:r>
+        <w:rPr>
+          <w:shd w:fill="81D41A" w:val="clear"/>
+        </w:rPr>
+        <w:t>(Дополнительно можно держать “матчи сыграно” просто как статистику.)</w:t>
+      </w:r>
+    </w:p>
+    <w:p>
+      <w:pPr>
+        <w:pStyle w:val="Heading2"/>
+        <w:keepNext w:val="false"/>
+        <w:keepLines w:val="false"/>
+        <w:spacing w:lineRule="auto" w:line="240" w:before="360" w:after="80"/>
+        <w:rPr>
+          <w:highlight w:val="none"/>
+          <w:shd w:fill="81D41A" w:val="clear"/>
+        </w:rPr>
+      </w:pPr>
+      <w:bookmarkStart w:id="22" w:name="_uxdj764t0om1"/>
+      <w:bookmarkEnd w:id="22"/>
       <w:r>
         <w:rPr>
           <w:b/>
           <w:bCs/>
           <w:sz w:val="34"/>
           <w:szCs w:val="34"/>
-        </w:rPr>
-        <w:t>6.1 Индивидуальные очки (игрок)</w:t>
+          <w:shd w:fill="81D41A" w:val="clear"/>
+        </w:rPr>
+        <w:t>6.2 Очки команды в рамках турнира (формула на выбор админом)</w:t>
       </w:r>
     </w:p>
     <w:p>
       <w:pPr>
         <w:pStyle w:val="normal1"/>
         <w:spacing w:lineRule="auto" w:line="240" w:before="240" w:after="240"/>
-        <w:rPr/>
-      </w:pPr>
-      <w:r>
-        <w:rPr/>
-        <w:t>Так как “чисто киллы берём в расчёт”:</w:t>
-      </w:r>
-    </w:p>
-    <w:p>
-      <w:pPr>
-        <w:pStyle w:val="normal1"/>
-        <w:numPr>
-          <w:ilvl w:val="0"/>
-          <w:numId w:val="7"/>
-        </w:numPr>
-        <w:spacing w:lineRule="auto" w:line="240" w:before="240" w:after="240"/>
-        <w:ind w:hanging="360" w:start="720"/>
+        <w:rPr>
+          <w:highlight w:val="none"/>
+          <w:shd w:fill="81D41A" w:val="clear"/>
+        </w:rPr>
+      </w:pPr>
+      <w:r>
+        <w:rPr>
+          <w:shd w:fill="81D41A" w:val="clear"/>
+        </w:rPr>
+        <w:t>В турнире админ выбирает одну формулу из списка:</w:t>
+      </w:r>
+    </w:p>
+    <w:p>
+      <w:pPr>
+        <w:pStyle w:val="normal1"/>
+        <w:numPr>
+          <w:ilvl w:val="0"/>
+          <w:numId w:val="38"/>
+        </w:numPr>
+        <w:spacing w:lineRule="auto" w:line="240" w:before="240" w:after="0"/>
+        <w:ind w:hanging="360" w:start="720"/>
+        <w:rPr>
+          <w:highlight w:val="none"/>
+          <w:shd w:fill="81D41A" w:val="clear"/>
+        </w:rPr>
+      </w:pPr>
+      <w:r>
         <w:rPr>
           <w:b/>
           <w:bCs/>
+          <w:shd w:fill="81D41A" w:val="clear"/>
+        </w:rPr>
+        <w:t>Сумма киллов всех игроков команды</w:t>
+        <w:br/>
+      </w:r>
+      <w:r>
+        <w:rPr>
+          <w:shd w:fill="81D41A" w:val="clear"/>
+        </w:rPr>
+        <w:t>Очки команды = киллы игрок1 + игрок2 + …</w:t>
+      </w:r>
+    </w:p>
+    <w:p>
+      <w:pPr>
+        <w:pStyle w:val="normal1"/>
+        <w:numPr>
+          <w:ilvl w:val="0"/>
+          <w:numId w:val="38"/>
+        </w:numPr>
+        <w:spacing w:lineRule="auto" w:line="240" w:before="0" w:after="0"/>
+        <w:ind w:hanging="360" w:start="720"/>
+        <w:rPr>
+          <w:highlight w:val="none"/>
+          <w:shd w:fill="81D41A" w:val="clear"/>
         </w:rPr>
       </w:pPr>
       <w:r>
         <w:rPr>
           <w:b/>
           <w:bCs/>
-        </w:rPr>
-        <w:t>Очки игрока = количество киллов</w:t>
-      </w:r>
-    </w:p>
-    <w:p>
-      <w:pPr>
-        <w:pStyle w:val="normal1"/>
-        <w:spacing w:lineRule="auto" w:line="240" w:before="240" w:after="240"/>
-        <w:rPr/>
-      </w:pPr>
-      <w:r>
-        <w:rPr/>
-        <w:t>(Дополнительно можно держать “матчи сыграно” просто как статистику.)</w:t>
-      </w:r>
-    </w:p>
-    <w:p>
-      <w:pPr>
-        <w:pStyle w:val="Heading2"/>
-        <w:keepNext w:val="false"/>
-        <w:keepLines w:val="false"/>
-        <w:spacing w:lineRule="auto" w:line="240" w:before="360" w:after="80"/>
-        <w:rPr>
-          <w:b/>
-          <w:bCs/>
-          <w:sz w:val="34"/>
-          <w:szCs w:val="34"/>
-        </w:rPr>
-      </w:pPr>
-      <w:bookmarkStart w:id="22" w:name="_uxdj764t0om1"/>
-      <w:bookmarkEnd w:id="22"/>
-      <w:r>
-        <w:rPr>
-          <w:b/>
-          <w:bCs/>
-          <w:sz w:val="34"/>
-          <w:szCs w:val="34"/>
-        </w:rPr>
-        <w:t>6.2 Очки команды в рамках турнира (формула на выбор админом)</w:t>
-      </w:r>
-    </w:p>
-    <w:p>
-      <w:pPr>
-        <w:pStyle w:val="normal1"/>
-        <w:spacing w:lineRule="auto" w:line="240" w:before="240" w:after="240"/>
-        <w:rPr/>
-      </w:pPr>
-      <w:r>
-        <w:rPr/>
-        <w:t>В турнире админ выбирает одну формулу из списка:</w:t>
-      </w:r>
-    </w:p>
-    <w:p>
-      <w:pPr>
-        <w:pStyle w:val="normal1"/>
-        <w:numPr>
-          <w:ilvl w:val="0"/>
-          <w:numId w:val="38"/>
-        </w:numPr>
-        <w:spacing w:lineRule="auto" w:line="240" w:before="240" w:after="0"/>
-        <w:ind w:hanging="360" w:start="720"/>
-        <w:rPr/>
-      </w:pPr>
-      <w:r>
-        <w:rPr>
-          <w:b/>
-          <w:bCs/>
-        </w:rPr>
-        <w:t>Сумма киллов всех игроков команды</w:t>
-        <w:br/>
-      </w:r>
-      <w:r>
-        <w:rPr/>
-        <w:t>Очки команды = киллы игрок1 + игрок2 + …</w:t>
-      </w:r>
-    </w:p>
-    <w:p>
-      <w:pPr>
-        <w:pStyle w:val="normal1"/>
-        <w:numPr>
-          <w:ilvl w:val="0"/>
-          <w:numId w:val="38"/>
-        </w:numPr>
-        <w:spacing w:lineRule="auto" w:line="240" w:before="0" w:after="0"/>
-        <w:ind w:hanging="360" w:start="720"/>
-        <w:rPr/>
-      </w:pPr>
-      <w:r>
-        <w:rPr>
-          <w:b/>
-          <w:bCs/>
+          <w:shd w:fill="81D41A" w:val="clear"/>
         </w:rPr>
         <w:t>Топ-N игроков команды</w:t>
       </w:r>
       <w:r>
-        <w:rPr/>
+        <w:rPr>
+          <w:shd w:fill="81D41A" w:val="clear"/>
+        </w:rPr>
         <w:t xml:space="preserve"> (например, топ-3)</w:t>
         <w:br/>
         <w:t>Очки команды = сумма киллов лучших N игроков</w:t>
@@ -4768,18 +4955,24 @@
         </w:numPr>
         <w:spacing w:lineRule="auto" w:line="240" w:before="0" w:after="240"/>
         <w:ind w:hanging="360" w:start="720"/>
-        <w:rPr/>
+        <w:rPr>
+          <w:highlight w:val="none"/>
+          <w:shd w:fill="81D41A" w:val="clear"/>
+        </w:rPr>
       </w:pPr>
       <w:r>
         <w:rPr>
           <w:b/>
           <w:bCs/>
+          <w:shd w:fill="81D41A" w:val="clear"/>
         </w:rPr>
         <w:t>Среднее по игрокам</w:t>
         <w:br/>
       </w:r>
       <w:r>
-        <w:rPr/>
+        <w:rPr>
+          <w:shd w:fill="81D41A" w:val="clear"/>
+        </w:rPr>
         <w:t>Очки команды = (сумма киллов) / (количество игроков)</w:t>
       </w:r>
     </w:p>
@@ -4787,10 +4980,15 @@
       <w:pPr>
         <w:pStyle w:val="normal1"/>
         <w:spacing w:lineRule="auto" w:line="240" w:before="240" w:after="240"/>
-        <w:rPr/>
-      </w:pPr>
-      <w:r>
-        <w:rPr/>
+        <w:rPr>
+          <w:highlight w:val="none"/>
+          <w:shd w:fill="81D41A" w:val="clear"/>
+        </w:rPr>
+      </w:pPr>
+      <w:r>
+        <w:rPr>
+          <w:shd w:fill="81D41A" w:val="clear"/>
+        </w:rPr>
         <w:t>Бот в карточке турнира показывает выбранную формулу “простыми словами”.</w:t>
       </w:r>
     </w:p>
@@ -7653,20 +7851,19 @@
         <w:keepLines w:val="false"/>
         <w:spacing w:lineRule="auto" w:line="240" w:before="360" w:after="80"/>
         <w:rPr>
+          <w:highlight w:val="none"/>
+          <w:shd w:fill="81D41A" w:val="clear"/>
+        </w:rPr>
+      </w:pPr>
+      <w:bookmarkStart w:id="36" w:name="_3uj0y2spkwzj"/>
+      <w:bookmarkEnd w:id="36"/>
+      <w:r>
+        <w:rPr>
           <w:b/>
           <w:bCs/>
           <w:sz w:val="34"/>
           <w:szCs w:val="34"/>
-        </w:rPr>
-      </w:pPr>
-      <w:bookmarkStart w:id="36" w:name="_3uj0y2spkwzj"/>
-      <w:bookmarkEnd w:id="36"/>
-      <w:r>
-        <w:rPr>
-          <w:b/>
-          <w:bCs/>
-          <w:sz w:val="34"/>
-          <w:szCs w:val="34"/>
+          <w:shd w:fill="81D41A" w:val="clear"/>
         </w:rPr>
         <w:t>7.9 Рефералка (супер-админ)</w:t>
       </w:r>
@@ -7675,10 +7872,15 @@
       <w:pPr>
         <w:pStyle w:val="normal1"/>
         <w:spacing w:lineRule="auto" w:line="240" w:before="240" w:after="240"/>
-        <w:rPr/>
-      </w:pPr>
-      <w:r>
-        <w:rPr/>
+        <w:rPr>
+          <w:highlight w:val="none"/>
+          <w:shd w:fill="81D41A" w:val="clear"/>
+        </w:rPr>
+      </w:pPr>
+      <w:r>
+        <w:rPr>
+          <w:shd w:fill="81D41A" w:val="clear"/>
+        </w:rPr>
         <w:t>Настройки “простым языком”:</w:t>
       </w:r>
     </w:p>
@@ -7691,14 +7893,21 @@
         </w:numPr>
         <w:spacing w:lineRule="auto" w:line="240" w:before="240" w:after="0"/>
         <w:ind w:hanging="360" w:start="720"/>
-        <w:rPr/>
-      </w:pPr>
-      <w:r>
-        <w:rPr/>
+        <w:rPr>
+          <w:highlight w:val="none"/>
+          <w:shd w:fill="81D41A" w:val="clear"/>
+        </w:rPr>
+      </w:pPr>
+      <w:r>
+        <w:rPr>
+          <w:shd w:fill="81D41A" w:val="clear"/>
+        </w:rPr>
         <w:t>“</w:t>
       </w:r>
       <w:r>
-        <w:rPr/>
+        <w:rPr>
+          <w:shd w:fill="81D41A" w:val="clear"/>
+        </w:rPr>
         <w:t>Сколько токенов даём за приглашённого”</w:t>
       </w:r>
     </w:p>
@@ -7711,14 +7920,21 @@
         </w:numPr>
         <w:spacing w:lineRule="auto" w:line="240" w:before="0" w:after="0"/>
         <w:ind w:hanging="360" w:start="720"/>
-        <w:rPr/>
-      </w:pPr>
-      <w:r>
-        <w:rPr/>
+        <w:rPr>
+          <w:highlight w:val="none"/>
+          <w:shd w:fill="81D41A" w:val="clear"/>
+        </w:rPr>
+      </w:pPr>
+      <w:r>
+        <w:rPr>
+          <w:shd w:fill="81D41A" w:val="clear"/>
+        </w:rPr>
         <w:t>“</w:t>
       </w:r>
       <w:r>
-        <w:rPr/>
+        <w:rPr>
+          <w:shd w:fill="81D41A" w:val="clear"/>
+        </w:rPr>
         <w:t>Когда считаем приглашение засчитанным” (например: “когда друг зарегистрировался” или “когда сыграл 1 турнир”)</w:t>
       </w:r>
     </w:p>
@@ -7731,10 +7947,15 @@
         </w:numPr>
         <w:spacing w:lineRule="auto" w:line="240" w:before="0" w:after="240"/>
         <w:ind w:hanging="360" w:start="720"/>
-        <w:rPr/>
-      </w:pPr>
-      <w:r>
-        <w:rPr/>
+        <w:rPr>
+          <w:highlight w:val="none"/>
+          <w:shd w:fill="81D41A" w:val="clear"/>
+        </w:rPr>
+      </w:pPr>
+      <w:r>
+        <w:rPr>
+          <w:shd w:fill="81D41A" w:val="clear"/>
+        </w:rPr>
         <w:t>ограничения от накрутки (например: “1 аккаунт = 1 устройство/1 номер” — формулируем как правило, без деталей)</w:t>
       </w:r>
     </w:p>
@@ -17524,7 +17745,7 @@
     <w:pPr>
       <w:widowControl w:val="false"/>
       <w:suppressAutoHyphens w:val="true"/>
-      <w:overflowPunct w:val="true"/>
+      <w:overflowPunct w:val="false"/>
       <w:bidi w:val="0"/>
       <w:spacing w:before="0" w:after="0"/>
       <w:jc w:val="start"/>
@@ -17734,7 +17955,7 @@
     <w:pPr>
       <w:widowControl/>
       <w:suppressAutoHyphens w:val="true"/>
-      <w:overflowPunct w:val="true"/>
+      <w:overflowPunct w:val="false"/>
       <w:bidi w:val="0"/>
       <w:spacing w:lineRule="auto" w:line="276" w:before="0" w:after="0"/>
       <w:jc w:val="start"/>

</xml_diff>